<commit_message>
Clarify team-led AI usage in disclosure
</commit_message>
<xml_diff>
--- a/submission-documents/CodeStrata-AI-Disclosure.docx
+++ b/submission-documents/CodeStrata-AI-Disclosure.docx
@@ -77,7 +77,7 @@
     </w:p>
     <w:p>
       <w:r>
-        <w:t>Did your team use AI in developing this project? Yes - OpenAI Codex assisted development.</w:t>
+        <w:t>Did your team use AI in developing this project? Yes - Claude assisted scoping and OpenAI Codex assisted development.</w:t>
       </w:r>
       <w:r>
         <w:t xml:space="preserve"/>
@@ -94,7 +94,7 @@
     </w:p>
     <w:p>
       <w:r>
-        <w:t>AI assistance is disclosed below; the named team members are responsible for the submission.</w:t>
+        <w:t>Advay Vivek supplied the core ideas, accepted or rejected AI suggestions, and approved the project direction; the team reviewed the implementation and submission.</w:t>
       </w:r>
     </w:p>
     <w:p/>
@@ -149,66 +149,79 @@
     </w:p>
     <w:p>
       <w:r>
-        <w:t xml:space="preserve">Idea generation / brainstorming: AI assisted project scoping and the version-counterexample concept.</w:t>
-      </w:r>
-      <w:proofErr w:type="gramStart"/>
-      <w:r>
-        <w:t/>
+        <w:rPr>
+          <w:b/>
+        </w:rPr>
+        <w:t>Idea generation / brainstorming:</w:t>
       </w:r>
       <w:r>
-        <w:t xml:space="preserve"/>
-      </w:r>
-      <w:proofErr w:type="gramEnd"/>
-      <w:r>
-        <w:t/>
+        <w:t xml:space="preserve"> Advay Vivek proposed the core problem and version-counterexample concept. Claude helped explore project scope; Advay and the team analyzed options, and Advay approved or rejected suggestions.</w:t>
       </w:r>
     </w:p>
     <w:p>
       <w:r>
-        <w:t>Code generation or assistance: AI drafted analyzer, retrieval, UI, benchmark adapters, and CI; the team reviewed and tested the final code.</w:t>
+        <w:rPr>
+          <w:b/>
+        </w:rPr>
+        <w:t>Code generation or assistance:</w:t>
       </w:r>
       <w:r>
-        <w:t xml:space="preserve"/>
+        <w:t xml:space="preserve"> OpenAI Codex drafted the analyzer, retrieval, UI, benchmark adapters, and CI. Advay supplied core requirements and approved or rejected approaches; the team reviewed and tested the final code.</w:t>
       </w:r>
     </w:p>
     <w:p>
       <w:r>
-        <w:t>UI / UX design: AI drafted the light animated timeline and explanatory side panel.</w:t>
+        <w:rPr>
+          <w:b/>
+        </w:rPr>
+        <w:t>UI / UX design:</w:t>
       </w:r>
       <w:r>
-        <w:t xml:space="preserve"/>
+        <w:t xml:space="preserve"> AI drafted the light animated timeline and explanatory side panel from Advay's specific dashboard and light-theme colour-scheme inputs; the team reviewed the result.</w:t>
       </w:r>
     </w:p>
     <w:p>
       <w:r>
-        <w:t>Content creation: AI drafted README, demo narrative, deck, and validation report.</w:t>
+        <w:rPr>
+          <w:b/>
+        </w:rPr>
+        <w:t>Content creation:</w:t>
       </w:r>
       <w:r>
-        <w:t xml:space="preserve"/>
+        <w:t xml:space="preserve"> AI drafted the README, architectural diagram, demo narrative, deck, and validation report on explicit teammate instructions; Advay reviewed and approved the final content.</w:t>
       </w:r>
     </w:p>
     <w:p>
       <w:r>
-        <w:t>Data analysis: AI assisted benchmark setup and interpretation. Real-repository labels are AI-assisted, not independent human annotations.</w:t>
+        <w:rPr>
+          <w:b/>
+        </w:rPr>
+        <w:t>Data analysis:</w:t>
       </w:r>
       <w:r>
-        <w:t xml:space="preserve"/>
+        <w:t xml:space="preserve"> AI assisted benchmark setup and interpretation. Real-repository labels are AI-assisted, not independent human annotations.</w:t>
       </w:r>
     </w:p>
     <w:p>
       <w:r>
-        <w:t>Testing / debugging: AI drafted regression, browser, Docker, and evaluation checks; defects were corrected after validation.</w:t>
+        <w:rPr>
+          <w:b/>
+        </w:rPr>
+        <w:t>Testing / debugging:</w:t>
       </w:r>
       <w:r>
-        <w:t xml:space="preserve"/>
+        <w:t xml:space="preserve"> AI drafted regression, browser, Docker, and evaluation checks; defects were corrected after validation.</w:t>
       </w:r>
     </w:p>
     <w:p>
       <w:r>
-        <w:t>Other: Public BGE and Jina embedding weights run locally on CPU. The application does not call an LLM API.</w:t>
+        <w:rPr>
+          <w:b/>
+        </w:rPr>
+        <w:t>Other:</w:t>
       </w:r>
       <w:r>
-        <w:t xml:space="preserve"/>
+        <w:t xml:space="preserve"> Public BGE and Jina embedding weights run locally on CPU. The application does not call an LLM API; the core investigation logic remains deterministic.</w:t>
       </w:r>
     </w:p>
     <w:p/>
@@ -254,12 +267,12 @@
     </w:p>
     <w:p>
       <w:r>
-        <w:t>2. Origin: Both - team direction, AI-assisted design and implementation.</w:t>
+        <w:t>2. Origin: Both - Advay's core concept and approvals, AI-assisted design and implementation.</w:t>
       </w:r>
     </w:p>
     <w:p>
       <w:r>
-        <w:t xml:space="preserve">3. Tool: OpenAI Codex. Prompts: find behavior changes across renamed/moved code; use CPU only; attach source and uncertainty. Output: AST facts, lineage, bounded agent, counterexample view. Modifications: tests and conservative ambiguity handling.</w:t>
+        <w:t xml:space="preserve">3. Tools: Claude for scoping; OpenAI Codex for implementation. Prompts: find behavior changes across renamed/moved code; use CPU only; attach source and uncertainty. Output: AST facts, lineage, bounded agent, counterexample view. Advay approved or rejected suggestions; the team tested and refined ambiguity handling.</w:t>
       </w:r>
       <w:proofErr w:type="gramStart"/>
       <w:r>
@@ -279,7 +292,7 @@
     </w:p>
     <w:p>
       <w:r>
-        <w:t>2. Origin: Both - team direction, AI-assisted code and documentation.</w:t>
+        <w:t>2. Origin: Both - Advay's requirements and approvals, AI-assisted code and documentation.</w:t>
       </w:r>
     </w:p>
     <w:p>

</xml_diff>